<commit_message>
Minor changes based on feedback and whilst working on applying tool to dataset
</commit_message>
<xml_diff>
--- a/Certainty tool key details.docx
+++ b/Certainty tool key details.docx
@@ -23,7 +23,7 @@
         <w:pStyle w:val="FirstParagraph"/>
       </w:pPr>
       <w:r>
-        <w:t xml:space="preserve">This document gives the key details of the certainty tool. For each domain, the tool will predict the number of levels the evidence is downgraded. This will be based on pre-defined thresholds that would have been used in previous/current updates of an LSR (i.e., decided a priori). The tool then compares its estimated GRADE rating against the current/previous rating, and indicate whether any of the domains may change. Unless otherwise specified, the default thresholds used throughout the tool were based on data from other Cochrane LSRs. Specifically, using the data from each review to calculate the respective scores used within each domain that need a threshold, and comparing the scores with the number of downgrading levels reported by the review. Furthermore, all of the elements utilised within this certainty tool follow the core GRADE approach (a simplified approach for conducting GRADE for simple pairwise analyses)</w:t>
+        <w:t xml:space="preserve">This document gives the key details of the certainty tool. For each domain, the tool will predict the number of levels the evidence is downgraded. This will be based on pre-defined thresholds that would have been used in previous/current updates of an LSR (i.e., decided a priori). The tool then compares its estimated GRADE rating against the current/previous rating, and indicates whether any of the domains may change. Unless otherwise specified, the default thresholds used throughout the tool were based on data from other Cochrane LSRs. Specifically, using the data from each review to calculate the respective scores used within each domain that need a threshold, and comparing the scores with the number of downgrading levels reported by the review. Furthermore, all of the elements utilised within this certainty tool follow the core GRADE approach (a simplified approach for conducting GRADE for simple pairwise analyses)</w:t>
       </w:r>
       <w:r>
         <w:rPr>
@@ -78,7 +78,7 @@
         <w:pStyle w:val="BodyText"/>
       </w:pPr>
       <w:r>
-        <w:t xml:space="preserve">The score ranges from 1 (where all studies are of low risk of bias) to 3 (where all studies are of high risk of bias). A suggested default threshold of 1.5 was chosen from calculating the score from a selection of Cochrane reviews, and noting at what values the review groups started to downgrade. If the weighted average is 1.5 or higher, the tool will predict a downgrading of 1 level. By default, there is no threshold for downgrading 2 levels as this was rarely seen (even in cases where all studies were deemed to be high risk).</w:t>
+        <w:t xml:space="preserve">The score ranges from 1 (where all studies are of low risk of bias) to 3 (where all studies are of high risk of bias). A suggested default threshold of 1.5 was chosen from calculating the score from a selection of Cochrane reviews, and noting at what values the review groups started to downgrade. If the weighted average is 1.5 or higher, the tool will predict a downgrading of 1 level. Many Cochrane reviews never downgraded by 2 levels, even when all studies were deemed to be high risk. This may be due to hesitancy to downgrade so many levels. Nevertheless, a threshold value of 2.5 for downgrading 2 leves due to risk of bias seems a sensible default.</w:t>
       </w:r>
     </w:p>
     <w:p>
@@ -137,7 +137,19 @@
         <w:t xml:space="preserve">2</w:t>
       </w:r>
       <w:r>
-        <w:t xml:space="preserve">. Implementing this would be a useful extension to improve the accuracy of the tool.</w:t>
+        <w:t xml:space="preserve">. Similarly, a study that may have a high risk of bias and a</w:t>
+      </w:r>
+      <w:r>
+        <w:t xml:space="preserve"> </w:t>
+      </w:r>
+      <w:r>
+        <w:t xml:space="preserve">‘large’</w:t>
+      </w:r>
+      <w:r>
+        <w:t xml:space="preserve"> </w:t>
+      </w:r>
+      <w:r>
+        <w:t xml:space="preserve">weighting may still not be cause for concern if its results are consistent with the low risk of bias results (i.e., the evidence may not need to be downgraded for risk of bias). Implementing this would be a useful extension to improve the accuracy of the tool.</w:t>
       </w:r>
     </w:p>
     <w:tbl>
@@ -264,6 +276,17 @@
               <w:t xml:space="preserve">If weighted average is 1.5 or higher, rate down by one level</w:t>
             </w:r>
           </w:p>
+          <w:p>
+            <w:pPr>
+              <w:numPr>
+                <w:ilvl w:val="0"/>
+                <w:numId w:val="1001"/>
+              </w:numPr>
+            </w:pPr>
+            <w:r>
+              <w:t xml:space="preserve">If weighted average is 2.5 or higher, rate down by two levels</w:t>
+            </w:r>
+          </w:p>
         </w:tc>
       </w:tr>
     </w:tbl>
@@ -282,7 +305,7 @@
         <w:pStyle w:val="FirstParagraph"/>
       </w:pPr>
       <w:r>
-        <w:t xml:space="preserve">Core GRADE users are encouraged to consider whether the confidence interval (CI) of the pooled effect includes both harm and benefit. If the CI is only in one area (e.g., entirely in clinical benefit), then core GRADE users are also encouraged to consider rating down if the total sample size or total number of events is small</w:t>
+        <w:t xml:space="preserve">Core GRADE users are encouraged to consider whether the 95% confidence interval (CI) of the pooled effect includes both harm and benefit. If the CI is only in one area (e.g., entirely in clinical benefit), then core GRADE users are also encouraged to consider rating down if the total sample size or total number of events is small</w:t>
       </w:r>
       <w:r>
         <w:rPr>
@@ -299,7 +322,7 @@
         <w:pStyle w:val="BodyText"/>
       </w:pPr>
       <w:r>
-        <w:t xml:space="preserve">Before using the tool, the review group need to decide what is a meaningful benefit or harm. These thresholds will then divide the effect size into three regions: no meaningful effect, meaningful benefit, and meaningful harm. Currently, this is set to be symmetrical (e.g., for RR, one could have regions of less than 0.75, 0.75 to 1.25, and more than 1.25). However, if that is unlikely, we can change the tool options. The defaults are +/- 0.25 for RR, and +/- 0.5 for MD, which were suggested defaults found in the literature. The tool then downgrades by one level if the CI covers two of these regions, and two levels if it covers all three regions.</w:t>
+        <w:t xml:space="preserve">Before using the tool, the review group need to decide what is a meaningful benefit or harm. These thresholds will then divide the effect size into three regions: no meaningful effect, meaningful benefit, and meaningful harm. The defaults are +/- 0.25 for RR, and +/- 0.5 for MD, which were suggested defaults found in the literature. The tool then downgrades by one level if the CI covers two of these regions, and two levels if it covers all three regions.</w:t>
       </w:r>
     </w:p>
     <w:p>
@@ -307,7 +330,15 @@
         <w:pStyle w:val="BodyText"/>
       </w:pPr>
       <w:r>
-        <w:t xml:space="preserve">For dichotomous outcomes, the tool will also consider the total number of events. The defaults, that are currently used in the e-cigarette review, are that less than 300 events should lead to downgrading by one level, and less than 100 events downgrade by two levels. However, each review group would be encouraged to consider what they deem as a small number of events as this will vary, especially for rare outcomes. As there are two criteria for downgrading dichotomous outcomes, the maximum suggested number of levels to downgrade will be taken as this encompasses any potential inconsistency identified.</w:t>
+        <w:t xml:space="preserve">In the discussion of the thesis, it may be worth considering the impact of using the prediction interval instead. In the interest of time, I will stick with the current GRADE guidance, but it may be something for GRADE to consider (or see if they have a reason for CI over PI under random-effects - such information may give more rationale for the current practice).</w:t>
+      </w:r>
+    </w:p>
+    <w:p>
+      <w:pPr>
+        <w:pStyle w:val="BodyText"/>
+      </w:pPr>
+      <w:r>
+        <w:t xml:space="preserve">For dichotomous outcomes, the tool will also consider the total number of events. The defaults, that are currently used in the e-cigarette review, are that fewer than 300 events should lead to downgrading by one level, and fewer than 100 events downgrade by two levels. However, each review group would be encouraged to consider what they deem as a small number of events as this will vary, especially for rare outcomes. As there are two criteria for downgrading dichotomous outcomes, the maximum suggested number of levels to downgrade will be taken as this encompasses any potential inconsistency identified.</w:t>
       </w:r>
     </w:p>
     <w:tbl>
@@ -507,7 +538,7 @@
         <w:pStyle w:val="FirstParagraph"/>
       </w:pPr>
       <w:r>
-        <w:t xml:space="preserve">In this first version of the tool, I am restricting dichotomous outcomes to be RR, and continuous outcomes to be MD. This follows the advise from GRADE, that is, it’s ideal to consider absolute effects, however, due to the ubiquitous inconsistency in absolute effects for dichotomous outcomes, identifying inconsistency of relative effects is of importance</w:t>
+        <w:t xml:space="preserve">In this first version of the tool, I am restricting dichotomous outcomes to be RR, and continuous outcomes to be MD. This follows the advice from GRADE, that is, it’s ideal to consider absolute effects, however, due to the ubiquitous inconsistency in absolute effects for dichotomous outcomes, identifying inconsistency of relative effects is of importance</w:t>
       </w:r>
       <w:r>
         <w:rPr>
@@ -550,7 +581,7 @@
         <w:pStyle w:val="BodyText"/>
       </w:pPr>
       <w:r>
-        <w:t xml:space="preserve">Based on a designated value of importance (given by the user), the tool calculates the proportion of study estimates that were on one side of the threshold. The resulting value will range from 50% (studies are equally spread either side of the threshold) to 100% (all studies are on one side of the threshold). The default threshold will simply be the null value (0 for differences, 1 for ratios).</w:t>
+        <w:t xml:space="preserve">Based on a designated value of importance (given by the user), the tool calculates the proportion of study estimates that were on one side of the threshold. The resulting value will range from 0.5 (studies are equally spread either side of the threshold) to 1 (all studies are on one side of the threshold). The default threshold will simply be the null value (0 for differences, 1 for ratios).</w:t>
       </w:r>
     </w:p>
     <w:p>
@@ -725,7 +756,7 @@
         <w:pStyle w:val="FirstParagraph"/>
       </w:pPr>
       <w:r>
-        <w:t xml:space="preserve">This can be extended to intervals, by dividing the common range by the combined range. As we often have more than two intervals, we’re interested in the overall similarity (rather than the strict overlap of all CIs). We therefore use the pairwise average Jaccard Index</w:t>
+        <w:t xml:space="preserve">This can be extended to intervals, by dividing the common range by the combined range. As we often have more than two intervals/studies, we’re interested in the overall similarity (rather than the strict overlap of all study CIs). We therefore use the pairwise average Jaccard Index</w:t>
       </w:r>
       <w:r>
         <w:rPr>
@@ -913,7 +944,7 @@
         <w:t xml:space="preserve"> </w:t>
       </w:r>
       <w:r>
-        <w:t xml:space="preserve">is the number of CIs. To calculate the intersection and union of two sets of CIs:</w:t>
+        <w:t xml:space="preserve">is the number of CIs (or studies). To calculate the intersection and union of two sets of CIs:</w:t>
       </w:r>
     </w:p>
     <w:p>
@@ -1492,7 +1523,7 @@
         <w:t xml:space="preserve"> </w:t>
       </w:r>
       <w:r>
-        <w:t xml:space="preserve">was used (which is always advised to be used with caution). Instead, the following default values were mostly chosen based on intuition. Any lack of overlap in CIs will likely not be cause for concern if the point estimates are all on one side of a threshold. As such, the tool considers the variation in point estimates first (with a threshold of 0.8 or higher indicating no concern). If the variation value is less than 0.8, the tool then considers the average pairwise Jaccard index, and will rate down for inconsistency if it is less than 0.4 (this value was chosen as all the Cochrane reviews that did downgrade for inconsistency had a index value less than 0.4). Further work to obtain more evidence-based default values would be desired.</w:t>
+        <w:t xml:space="preserve">was used (which is always advised to be used with caution). Instead, the following default values were mostly chosen based on intuition. Any lack of overlap in CIs will likely not be cause for concern if the point estimates are all on one side of a threshold. As such, the tool considers the variation in point estimates first (with a threshold of 0.8 or higher indicating no concern). If the variation value is less than 0.8, the tool then considers the average pairwise Jaccard index, and will rate down for inconsistency if it is less than 0.4 (this value was chosen as all the Cochrane reviews that did downgrade for inconsistency had an index value less than 0.4). Further work to obtain more evidence-based default values would be desired.</w:t>
       </w:r>
     </w:p>
     <w:tbl>
@@ -1822,7 +1853,7 @@
               <w:t xml:space="preserve"> </w:t>
             </w:r>
             <w:r>
-              <w:t xml:space="preserve">of studies, downgrade one level.</w:t>
+              <w:t xml:space="preserve">of studies.</w:t>
             </w:r>
           </w:p>
         </w:tc>
@@ -1871,7 +1902,7 @@
         </w:numPr>
       </w:pPr>
       <w:r>
-        <w:t xml:space="preserve">Are the populations presented in the current evidence so much more restrictive than the target population of the review that they’re likely to affect the magnitude of effect substantially? If so, is it serious or very serious?</w:t>
+        <w:t xml:space="preserve">Are the populations presented in the current evidence so much more difference than the target population of the review that they’re likely to affect the magnitude of effect substantially? If so, is it serious or very serious?</w:t>
       </w:r>
     </w:p>
     <w:p>
@@ -1882,7 +1913,7 @@
         </w:numPr>
       </w:pPr>
       <w:r>
-        <w:t xml:space="preserve">Are the interventions that have been studied in the current pool of evidence more restrictive than the target interventions of the review? If so, is it serious or very serious?</w:t>
+        <w:t xml:space="preserve">Are the interventions that have been studied in the current pool of evidence different from the target interventions of the review? If so, is it serious or very serious?</w:t>
       </w:r>
     </w:p>
     <w:p>
@@ -1893,7 +1924,7 @@
         </w:numPr>
       </w:pPr>
       <w:r>
-        <w:t xml:space="preserve">Are the comparators that have been included in the current studies more restrictive than the target comparator(s) of the review? If so, is it serious or very serious?</w:t>
+        <w:t xml:space="preserve">Are the comparators that have been included in the current studies different from the target comparator(s) of the review? If so, is it serious or very serious?</w:t>
       </w:r>
     </w:p>
     <w:p>
@@ -1904,7 +1935,7 @@
         </w:numPr>
       </w:pPr>
       <w:r>
-        <w:t xml:space="preserve">Are the outcomes that are presented in the current evidence more restrictive than the target outcomes of the review? If so, is it serious or very serious?</w:t>
+        <w:t xml:space="preserve">Are the outcomes that are presented in the current evidence different from the target outcomes of the review? If so, is it serious or very serious?</w:t>
       </w:r>
     </w:p>
     <w:p>
@@ -1921,7 +1952,7 @@
         <w:t xml:space="preserve">9</w:t>
       </w:r>
       <w:r>
-        <w:t xml:space="preserve">. As such, the user will simply be asked to judge the evidence based on the prompt questions, as to whether any problems identified need to be rates down by two, one, or no levels.</w:t>
+        <w:t xml:space="preserve">. As such, the user will simply be asked to judge the evidence based on the prompt questions, as to whether any problems identified need to be rated down by two, one, or no levels.</w:t>
       </w:r>
     </w:p>
     <w:bookmarkEnd w:id="33"/>
@@ -1980,7 +2011,7 @@
         <w:pStyle w:val="FirstParagraph"/>
       </w:pPr>
       <w:r>
-        <w:t xml:space="preserve">However, only observational studies with no major threats to validity (i.e. that have not been downgraded) can be upgraded. As we will be focusing on RCTs in the first instance, we will not consider these elements initially.</w:t>
+        <w:t xml:space="preserve">Previously, only observational studies with no major threats to validity (i.e. that have not been downgraded) can be upgraded. Recently however, new guidance suggests that not all observational studies have to start at a lower level if reviewers are using ROBINS-I or ROBINS-E. As there is nuance regarding whether upgrading is appropriate, and that we will be focusing on RCTs in the first instance, we will not consider these elements initially.</w:t>
       </w:r>
     </w:p>
     <w:bookmarkEnd w:id="34"/>

</xml_diff>